<commit_message>
Add local Word COM QA script and tighten Navarino CV to 2 pages
Cloud cannot mount E:\, so add Copy-ToLocalAndWordComQa.ps1 for Windows Word COM PDF/PNG QA beside preserved originals. Rebuild CV to 2 pages after visual QA found a sparse page 3; include LibreOffice proxy renders and QA report.

Co-authored-by: leejunha781 <leejunha781@users.noreply.github.com>
</commit_message>
<xml_diff>
--- a/career/navarino-account-manager/Joonha_Lee_NAVARINO_Account_Manager_Professional_CV_Revised_JD_Fit_20260721.docx
+++ b/career/navarino-account-manager/Joonha_Lee_NAVARINO_Account_Manager_Professional_CV_Revised_JD_Fit_20260721.docx
@@ -155,22 +155,7 @@
           <w:color w:val="444444"/>
           <w:sz w:val="19"/>
         </w:rPr>
-        <w:t>Operated as a reliable cross-functional interface between engineering, QA, and customer stakeholders, supporting pre-sale clarity and post-sale issue resolution.</w:t>
-      </w:r>
-    </w:p>
-    <w:p>
-      <w:pPr>
-        <w:pStyle w:val="ListBullet"/>
-        <w:spacing w:before="0" w:after="40" w:line="252" w:lineRule="auto"/>
-      </w:pPr>
-      <w:r>
-        <w:rPr>
-          <w:rFonts w:ascii="Calibri" w:hAnsi="Calibri" w:eastAsia="Malgun Gothic"/>
-          <w:b w:val="0"/>
-          <w:color w:val="444444"/>
-          <w:sz w:val="19"/>
-        </w:rPr>
-        <w:t>Supported customer clarity in pre-sale technical discussions and post-sale validation handovers—practising the retention and expansion behaviours required for account management, while building commercial pipeline discipline for a full Account Manager remit.</w:t>
+        <w:t>Operated as a reliable cross-functional interface for pre-sale clarity and post-sale validation—practising retention/expansion behaviours and commercial pipeline discipline for a full Account Manager remit.</w:t>
       </w:r>
     </w:p>
     <w:p>
@@ -378,22 +363,7 @@
           <w:color w:val="444444"/>
           <w:sz w:val="19"/>
         </w:rPr>
-        <w:t>Led project scheduling and quality-assurance gates, creating a reliable cadence for cross-functional delivery and customer-facing technical reviews.</w:t>
-      </w:r>
-    </w:p>
-    <w:p>
-      <w:pPr>
-        <w:pStyle w:val="ListBullet"/>
-        <w:spacing w:before="0" w:after="40" w:line="252" w:lineRule="auto"/>
-      </w:pPr>
-      <w:r>
-        <w:rPr>
-          <w:rFonts w:ascii="Calibri" w:hAnsi="Calibri" w:eastAsia="Malgun Gothic"/>
-          <w:b w:val="0"/>
-          <w:color w:val="444444"/>
-          <w:sz w:val="19"/>
-        </w:rPr>
-        <w:t>Supported FAT/SAT and commissioning-oriented engagement—translating RF, network, and system evidence into clear stakeholder communication suitable for commercial account care.</w:t>
+        <w:t>Led project scheduling and quality-assurance gates for cross-functional delivery and customer-facing technical reviews; supported FAT/SAT and commissioning with clear stakeholder communication.</w:t>
       </w:r>
     </w:p>
     <w:p>
@@ -423,7 +393,7 @@
           <w:color w:val="444444"/>
           <w:sz w:val="19"/>
         </w:rPr>
-        <w:t>Applied KPI-minded progress tracking and structured collaboration (including Jira/Confluence-style work management habits) to keep priorities visible across engineering and customer stakeholders.</w:t>
+        <w:t>Applied KPI-minded progress tracking and Jira/Confluence-style collaboration habits to keep priorities visible across engineering and customer stakeholders.</w:t>
       </w:r>
     </w:p>
     <w:p>
@@ -557,7 +527,7 @@
           <w:color w:val="444444"/>
           <w:sz w:val="19"/>
         </w:rPr>
-        <w:t>Delivered multi-year naval communication and entertainment programmes for maritime customers, including the Indonesia submarine Entertainment System and PC Communication &amp; Broadcasting Systems—managing interface clarity, integration outcomes, and customer satisfaction across long programme lifecycles.</w:t>
+        <w:t>Delivered multi-year naval communication and entertainment programmes (Indonesia submarine Entertainment System; PC Communication &amp; Broadcasting Systems), managing interface clarity, integration outcomes, and customer satisfaction across long programme lifecycles.</w:t>
       </w:r>
     </w:p>
     <w:p>
@@ -572,7 +542,7 @@
           <w:color w:val="444444"/>
           <w:sz w:val="19"/>
         </w:rPr>
-        <w:t>Spearheaded Integrated Communication System (ICS) development for a 300-ton class submarine and supported 3000-ton class submarine ICS activities, coordinating shipboard communication architectures under demanding technical and regulatory constraints.</w:t>
+        <w:t>Spearheaded ICS development for a 300-ton class submarine and supported 3000-ton class submarine ICS; developed internal wireless/broadcasting for Korean frigates under demanding technical and regulatory constraints.</w:t>
       </w:r>
     </w:p>
     <w:p>
@@ -587,7 +557,7 @@
           <w:color w:val="444444"/>
           <w:sz w:val="19"/>
         </w:rPr>
-        <w:t>Developed internal wireless and broadcasting systems for Korean frigates, improving onboard communication effectiveness for operational users.</w:t>
+        <w:t>Performed V/UHF and satcom signal specification analysis, wiring diagrams, integration testing, and interface-box design for military secure equipment—building evidence-first, cybersecurity/OT-aware discipline transferable to commercial maritime SLA conversations.</w:t>
       </w:r>
     </w:p>
     <w:p>
@@ -602,37 +572,7 @@
           <w:color w:val="444444"/>
           <w:sz w:val="19"/>
         </w:rPr>
-        <w:t>Performed V/UHF and satellite-communication signal specification analysis, designed wiring diagrams, executed integration testing, and corrected system/wiring defects—building an evidence-first culture transferable to commercial maritime SLA and quality conversations.</w:t>
-      </w:r>
-    </w:p>
-    <w:p>
-      <w:pPr>
-        <w:pStyle w:val="ListBullet"/>
-        <w:spacing w:before="0" w:after="40" w:line="252" w:lineRule="auto"/>
-      </w:pPr>
-      <w:r>
-        <w:rPr>
-          <w:rFonts w:ascii="Calibri" w:hAnsi="Calibri" w:eastAsia="Malgun Gothic"/>
-          <w:b w:val="0"/>
-          <w:color w:val="444444"/>
-          <w:sz w:val="19"/>
-        </w:rPr>
-        <w:t>Designed interface boxes and connection schemes for military secure equipment, strengthening secure-integration literacy relevant to modern fleet cybersecurity and OT discussions.</w:t>
-      </w:r>
-    </w:p>
-    <w:p>
-      <w:pPr>
-        <w:pStyle w:val="ListBullet"/>
-        <w:spacing w:before="0" w:after="40" w:line="252" w:lineRule="auto"/>
-      </w:pPr>
-      <w:r>
-        <w:rPr>
-          <w:rFonts w:ascii="Calibri" w:hAnsi="Calibri" w:eastAsia="Malgun Gothic"/>
-          <w:b w:val="0"/>
-          <w:color w:val="444444"/>
-          <w:sz w:val="19"/>
-        </w:rPr>
-        <w:t>Sustained long-horizon relationships with shipyards, technical managers, and programme stakeholders—demonstrating the retention and trust behaviours expected of an Account Manager in the maritime sector.</w:t>
+        <w:t>Sustained long-horizon relationships with shipyards, technical managers, and programme stakeholders—demonstrating the retention and trust behaviours expected of a maritime Account Manager.</w:t>
       </w:r>
     </w:p>
     <w:p>
@@ -692,22 +632,7 @@
           <w:color w:val="444444"/>
           <w:sz w:val="19"/>
         </w:rPr>
-        <w:t>Focus areas: embedded systems development, hardware/PCB design, industrial networking, OS-level programming (Linux/Windows), and real-time control interfaces.</w:t>
-      </w:r>
-    </w:p>
-    <w:p>
-      <w:pPr>
-        <w:pStyle w:val="ListBullet"/>
-        <w:spacing w:before="0" w:after="40" w:line="252" w:lineRule="auto"/>
-      </w:pPr>
-      <w:r>
-        <w:rPr>
-          <w:rFonts w:ascii="Calibri" w:hAnsi="Calibri" w:eastAsia="Malgun Gothic"/>
-          <w:b w:val="0"/>
-          <w:color w:val="444444"/>
-          <w:sz w:val="19"/>
-        </w:rPr>
-        <w:t>Research emphasis on high-performance embedded control with industrial Ethernet (EtherCAT) for synchronized multi-peripheral systems.</w:t>
+        <w:t>Focus: embedded systems, hardware/PCB design, industrial networking, OS-level programming (Linux/Windows); research on real-time embedded control with industrial Ethernet (EtherCAT).</w:t>
       </w:r>
     </w:p>
     <w:p>
@@ -767,7 +692,7 @@
           <w:color w:val="444444"/>
           <w:sz w:val="19"/>
         </w:rPr>
-        <w:t>Vision fit: prepared to represent Navarino’s ambition to be the benchmark technology company of the maritime world—Integrity, Excellence, and Innovation in every customer interaction.</w:t>
+        <w:t>Vision fit: represent Navarino’s ambition to be the benchmark maritime technology company—Integrity, Excellence, and Innovation in every customer interaction.</w:t>
       </w:r>
     </w:p>
     <w:p>
@@ -782,7 +707,7 @@
           <w:color w:val="444444"/>
           <w:sz w:val="19"/>
         </w:rPr>
-        <w:t>Portfolio conversation fluency (learning, not product ownership): connectivity (Starlink/hybrid), Infinity bandwidth/network management, Spectrum RMM/asset inventory, Quazar IT-as-a-Service, and cybersecurity/OT themes (Angel/Ozora/NEMO).</w:t>
+        <w:t>Portfolio conversation fluency (learning, not product ownership): Starlink/hybrid connectivity, Infinity bandwidth/network management, Spectrum RMM/asset inventory, Quazar IT-as-a-Service, cybersecurity/OT (Angel/Ozora/NEMO).</w:t>
       </w:r>
     </w:p>
     <w:p>
@@ -797,22 +722,7 @@
           <w:color w:val="444444"/>
           <w:sz w:val="19"/>
         </w:rPr>
-        <w:t>Commercial motion: account retention + expansion through consultative discovery with operators, technical managers, IT stakeholders, and compliance-adjacent roles (including growing fluency with DPA/crewing decision chains).</w:t>
-      </w:r>
-    </w:p>
-    <w:p>
-      <w:pPr>
-        <w:pStyle w:val="ListBullet"/>
-        <w:spacing w:before="0" w:after="40" w:line="252" w:lineRule="auto"/>
-      </w:pPr>
-      <w:r>
-        <w:rPr>
-          <w:rFonts w:ascii="Calibri" w:hAnsi="Calibri" w:eastAsia="Malgun Gothic"/>
-          <w:b w:val="0"/>
-          <w:color w:val="444444"/>
-          <w:sz w:val="19"/>
-        </w:rPr>
-        <w:t>Digital ops adjacency: commercial PLM/ERP/Jira/Confluence/KPI literacy supports structured CRM hygiene, opportunity tracking, and measurable account performance without claiming proprietary Navarino product employment history.</w:t>
+        <w:t>Commercial motion: retention and expansion via consultative discovery with operators, technical managers, IT, and compliance-adjacent roles; growing fluency with DPA/crewing decision chains; CRM hygiene via PLM/ERP/Jira/Confluence/KPI literacy.</w:t>
       </w:r>
     </w:p>
     <w:p>
@@ -846,23 +756,9 @@
         <w:t>Korean (Native)  ·  English (Professional — customer engagement, written proposals, cross-border coordination)</w:t>
       </w:r>
     </w:p>
-    <w:p>
-      <w:pPr>
-        <w:spacing w:before="160" w:after="0" w:line="259" w:lineRule="auto"/>
-      </w:pPr>
-      <w:r>
-        <w:rPr>
-          <w:rFonts w:ascii="Calibri" w:hAnsi="Calibri" w:eastAsia="Malgun Gothic"/>
-          <w:b w:val="0"/>
-          <w:color w:val="777777"/>
-          <w:sz w:val="16"/>
-        </w:rPr>
-        <w:t>Document control: Revised JD Fit for Navarino Account Manager (Korea) — 2026-07-21. Canonical prior CV path preserved (not overwritten): e:\이력서\Account Manager\Joonha_Lee_NAVARINO_Account_Manager_Professional_CV.docx</w:t>
-      </w:r>
-    </w:p>
     <w:sectPr>
       <w:pgSz w:w="12240" w:h="15840"/>
-      <w:pgMar w:top="792" w:right="936" w:bottom="792" w:left="936" w:header="720" w:footer="720" w:gutter="0"/>
+      <w:pgMar w:top="720" w:right="864" w:bottom="720" w:left="864" w:header="720" w:footer="720" w:gutter="0"/>
       <w:cols w:space="720"/>
       <w:docGrid w:linePitch="360"/>
     </w:sectPr>

</xml_diff>